<commit_message>
Update Arb study notes for 2026-07-27 release
</commit_message>
<xml_diff>
--- a/spa/docx/44.content.docx
+++ b/spa/docx/44.content.docx
@@ -23455,7 +23455,7 @@
         <w:rPr>
           <w:lang w:val="es_ES" w:bidi="es_ES"/>
         </w:rPr>
-        <w:t xml:space="preserve">Comer alimentos ofrecidos a ídolos es pecaminoso si implica participar conscientemente en un sacrificio idolátrico (ver </w:t>
+        <w:t xml:space="preserve">Comer alimentos ofrecidos a los ídolos es pecaminoso cuando implica una participación activa en la adoración de ídolos (ver </w:t>
       </w:r>
       <w:hyperlink r:id="rId647">
         <w:r>
@@ -23557,6 +23557,42 @@
             <w:u w:val="single"/>
           </w:rPr>
           <w:t>20</w:t>
+        </w:r>
+      </w:hyperlink>
+      <w:r>
+        <w:rPr>
+          <w:lang w:val="es_ES" w:bidi="es_ES"/>
+        </w:rPr>
+        <w:t>). Sin embargo, Pablo enseña que comer esos alimentos no siempre es incorrecto en sí mismo. La preocupación es si al comerla se lleva a pecar a un hermano en la fe que tiene una conciencia débil (</w:t>
+      </w:r>
+      <w:hyperlink r:id="rId649">
+        <w:r>
+          <w:rPr>
+            <w:lang w:val="es_ES" w:bidi="es_ES"/>
+          </w:rPr>
+          <w:rPr>
+            <w:color w:val="0000EE"/>
+            <w:u w:val="single"/>
+          </w:rPr>
+          <w:t>1 Cor 8:4–13</w:t>
+        </w:r>
+      </w:hyperlink>
+      <w:r>
+        <w:rPr>
+          <w:lang w:val="es_ES" w:bidi="es_ES"/>
+        </w:rPr>
+        <w:t>). Pablo también advierte en contra de comer en un templo pagano, ya que eso equivale a participar en la adoración de ídolos. Pero permite comer alimentos comprados en el mercado o servidos en una comida sin preguntar por su origen (</w:t>
+      </w:r>
+      <w:hyperlink r:id="rId650">
+        <w:r>
+          <w:rPr>
+            <w:lang w:val="es_ES" w:bidi="es_ES"/>
+          </w:rPr>
+          <w:rPr>
+            <w:color w:val="0000EE"/>
+            <w:u w:val="single"/>
+          </w:rPr>
+          <w:t>10:14–30</w:t>
         </w:r>
       </w:hyperlink>
       <w:r>

</xml_diff>